<commit_message>
Updated final Module 1.2 document
</commit_message>
<xml_diff>
--- a/module-1/Cortez-Assignment1_2.docx
+++ b/module-1/Cortez-Assignment1_2.docx
@@ -72,10 +72,10 @@
       </w:pPr>
       <w:r>
         <w:drawing>
-          <wp:inline distT="0" distB="0" distL="0" distR="0" wp14:anchorId="5958B0A8" wp14:editId="1D4D808E">
-            <wp:extent cx="5943600" cy="2910205"/>
-            <wp:effectExtent l="0" t="0" r="0" b="4445"/>
-            <wp:docPr id="302569187" name="Picture 1"/>
+          <wp:inline distT="0" distB="0" distL="0" distR="0" wp14:anchorId="0C3B8FC0" wp14:editId="6B1DF017">
+            <wp:extent cx="5943600" cy="2818765"/>
+            <wp:effectExtent l="0" t="0" r="0" b="635"/>
+            <wp:docPr id="2106054834" name="Picture 1"/>
             <wp:cNvGraphicFramePr>
               <a:graphicFrameLocks xmlns:a="http://schemas.openxmlformats.org/drawingml/2006/main" noChangeAspect="1"/>
             </wp:cNvGraphicFramePr>
@@ -83,7 +83,7 @@
               <a:graphicData uri="http://schemas.openxmlformats.org/drawingml/2006/picture">
                 <pic:pic xmlns:pic="http://schemas.openxmlformats.org/drawingml/2006/picture">
                   <pic:nvPicPr>
-                    <pic:cNvPr id="302569187" name=""/>
+                    <pic:cNvPr id="2106054834" name=""/>
                     <pic:cNvPicPr/>
                   </pic:nvPicPr>
                   <pic:blipFill>
@@ -95,7 +95,7 @@
                   <pic:spPr>
                     <a:xfrm>
                       <a:off x="0" y="0"/>
-                      <a:ext cx="5943600" cy="2910205"/>
+                      <a:ext cx="5943600" cy="2818765"/>
                     </a:xfrm>
                     <a:prstGeom prst="rect">
                       <a:avLst/>
@@ -166,6 +166,13 @@
     </w:p>
     <w:p>
       <w:pPr>
+        <w:tabs>
+          <w:tab w:val="left" w:pos="4105"/>
+        </w:tabs>
+      </w:pPr>
+    </w:p>
+    <w:p>
+      <w:pPr>
         <w:pStyle w:val="ListParagraph"/>
         <w:numPr>
           <w:ilvl w:val="0"/>
@@ -188,6 +195,9 @@
         <w:ind w:left="360"/>
       </w:pPr>
       <w:r>
+        <w:rPr>
+          <w:noProof/>
+        </w:rPr>
         <w:drawing>
           <wp:inline distT="0" distB="0" distL="0" distR="0" wp14:anchorId="506CEA99" wp14:editId="191743A7">
             <wp:extent cx="5752531" cy="2350794"/>
@@ -932,6 +942,7 @@
   <w:style w:type="character" w:default="1" w:styleId="DefaultParagraphFont">
     <w:name w:val="Default Paragraph Font"/>
     <w:uiPriority w:val="1"/>
+    <w:semiHidden/>
     <w:unhideWhenUsed/>
   </w:style>
   <w:style w:type="table" w:default="1" w:styleId="TableNormal">

</xml_diff>